<commit_message>
Validação de CPF duplicado, + segurança no SQL e Update Dicionário
Adição de código no back-end para validação de CPF duplicado, troca de "char" para "enum" para maior segurança, integridade e restrição ao invasor e cliente e atualização no dicionário de dados devido à alteração no banco de dados dito no processo anterior
</commit_message>
<xml_diff>
--- a/Documentação/Dicionário de Dados/Dicionário de Dados - SIGEPI.docx
+++ b/Documentação/Dicionário de Dados/Dicionário de Dados - SIGEPI.docx
@@ -1,6 +1,6 @@
 
 <file path=word/document.xml><?xml version="1.0" encoding="utf-8"?>
-<w:document xmlns:wpc="http://schemas.microsoft.com/office/word/2010/wordprocessingCanvas" xmlns:cx="http://schemas.microsoft.com/office/drawing/2014/chartex" xmlns:mc="http://schemas.openxmlformats.org/markup-compatibility/2006" xmlns:o="urn:schemas-microsoft-com:office:office" xmlns:r="http://schemas.openxmlformats.org/officeDocument/2006/relationships" xmlns:m="http://schemas.openxmlformats.org/officeDocument/2006/math" xmlns:v="urn:schemas-microsoft-com:vml" xmlns:wp14="http://schemas.microsoft.com/office/word/2010/wordprocessingDrawing" xmlns:wp="http://schemas.openxmlformats.org/drawingml/2006/wordprocessingDrawing" xmlns:w10="urn:schemas-microsoft-com:office:word" xmlns:w="http://schemas.openxmlformats.org/wordprocessingml/2006/main" xmlns:w14="http://schemas.microsoft.com/office/word/2010/wordml" xmlns:w15="http://schemas.microsoft.com/office/word/2012/wordml" xmlns:w16se="http://schemas.microsoft.com/office/word/2015/wordml/symex" xmlns:wpg="http://schemas.microsoft.com/office/word/2010/wordprocessingGroup" xmlns:wpi="http://schemas.microsoft.com/office/word/2010/wordprocessingInk" xmlns:wne="http://schemas.microsoft.com/office/word/2006/wordml" xmlns:wps="http://schemas.microsoft.com/office/word/2010/wordprocessingShape" mc:Ignorable="w14 w15 w16se wp14">
+<w:document xmlns:wpc="http://schemas.microsoft.com/office/word/2010/wordprocessingCanvas" xmlns:cx="http://schemas.microsoft.com/office/drawing/2014/chartex" xmlns:cx1="http://schemas.microsoft.com/office/drawing/2015/9/8/chartex" xmlns:cx2="http://schemas.microsoft.com/office/drawing/2015/10/21/chartex" xmlns:cx3="http://schemas.microsoft.com/office/drawing/2016/5/9/chartex" xmlns:cx4="http://schemas.microsoft.com/office/drawing/2016/5/10/chartex" xmlns:cx5="http://schemas.microsoft.com/office/drawing/2016/5/11/chartex" xmlns:cx6="http://schemas.microsoft.com/office/drawing/2016/5/12/chartex" xmlns:cx7="http://schemas.microsoft.com/office/drawing/2016/5/13/chartex" xmlns:cx8="http://schemas.microsoft.com/office/drawing/2016/5/14/chartex" xmlns:mc="http://schemas.openxmlformats.org/markup-compatibility/2006" xmlns:aink="http://schemas.microsoft.com/office/drawing/2016/ink" xmlns:am3d="http://schemas.microsoft.com/office/drawing/2017/model3d" xmlns:o="urn:schemas-microsoft-com:office:office" xmlns:oel="http://schemas.microsoft.com/office/2019/extlst" xmlns:r="http://schemas.openxmlformats.org/officeDocument/2006/relationships" xmlns:m="http://schemas.openxmlformats.org/officeDocument/2006/math" xmlns:v="urn:schemas-microsoft-com:vml" xmlns:wp14="http://schemas.microsoft.com/office/word/2010/wordprocessingDrawing" xmlns:wp="http://schemas.openxmlformats.org/drawingml/2006/wordprocessingDrawing" xmlns:w10="urn:schemas-microsoft-com:office:word" xmlns:w="http://schemas.openxmlformats.org/wordprocessingml/2006/main" xmlns:w14="http://schemas.microsoft.com/office/word/2010/wordml" xmlns:w15="http://schemas.microsoft.com/office/word/2012/wordml" xmlns:w16cex="http://schemas.microsoft.com/office/word/2018/wordml/cex" xmlns:w16cid="http://schemas.microsoft.com/office/word/2016/wordml/cid" xmlns:w16="http://schemas.microsoft.com/office/word/2018/wordml" xmlns:w16du="http://schemas.microsoft.com/office/word/2023/wordml/word16du" xmlns:w16sdtdh="http://schemas.microsoft.com/office/word/2020/wordml/sdtdatahash" xmlns:w16sdtfl="http://schemas.microsoft.com/office/word/2024/wordml/sdtformatlock" xmlns:w16se="http://schemas.microsoft.com/office/word/2015/wordml/symex" xmlns:wpg="http://schemas.microsoft.com/office/word/2010/wordprocessingGroup" xmlns:wpi="http://schemas.microsoft.com/office/word/2010/wordprocessingInk" xmlns:wne="http://schemas.microsoft.com/office/word/2006/wordml" xmlns:wps="http://schemas.microsoft.com/office/word/2010/wordprocessingShape" mc:Ignorable="w14 w15 w16se w16cid w16 w16cex w16sdtdh w16sdtfl w16du wp14">
   <w:body>
     <w:tbl>
       <w:tblPr>
@@ -343,8 +343,6 @@
       <w:r>
         <w:t>tb_empresa_</w:t>
       </w:r>
-      <w:bookmarkStart w:id="0" w:name="_GoBack"/>
-      <w:bookmarkEnd w:id="0"/>
       <w:r>
         <w:t>id_empresa</w:t>
       </w:r>
@@ -752,17 +750,12 @@
               <w:contextualSpacing w:val="0"/>
             </w:pPr>
             <w:proofErr w:type="spellStart"/>
-            <w:proofErr w:type="gramStart"/>
             <w:r>
               <w:t>Varchar</w:t>
             </w:r>
             <w:proofErr w:type="spellEnd"/>
             <w:r>
-              <w:t>(</w:t>
-            </w:r>
-            <w:proofErr w:type="gramEnd"/>
-            <w:r>
-              <w:t>45)</w:t>
+              <w:t>(45)</w:t>
             </w:r>
           </w:p>
           <w:p>
@@ -1208,17 +1201,12 @@
               <w:contextualSpacing w:val="0"/>
             </w:pPr>
             <w:proofErr w:type="spellStart"/>
-            <w:proofErr w:type="gramStart"/>
             <w:r>
               <w:t>Varchar</w:t>
             </w:r>
             <w:proofErr w:type="spellEnd"/>
             <w:r>
-              <w:t>(</w:t>
-            </w:r>
-            <w:proofErr w:type="gramEnd"/>
-            <w:r>
-              <w:t>100)</w:t>
+              <w:t>(100)</w:t>
             </w:r>
           </w:p>
           <w:p>
@@ -2189,17 +2177,12 @@
               <w:contextualSpacing w:val="0"/>
             </w:pPr>
             <w:proofErr w:type="spellStart"/>
-            <w:proofErr w:type="gramStart"/>
             <w:r>
               <w:t>Varchar</w:t>
             </w:r>
             <w:proofErr w:type="spellEnd"/>
             <w:r>
-              <w:t>(</w:t>
-            </w:r>
-            <w:proofErr w:type="gramEnd"/>
-            <w:r>
-              <w:t>45)</w:t>
+              <w:t>(45)</w:t>
             </w:r>
           </w:p>
           <w:p>
@@ -2409,10 +2392,12 @@
                 <w:numId w:val="2"/>
               </w:numPr>
               <w:spacing w:before="10" w:after="10"/>
-              <w:contextualSpacing w:val="0"/>
-            </w:pPr>
-            <w:r>
-              <w:t>Char (1)</w:t>
+            </w:pPr>
+            <w:r>
+              <w:t>E</w:t>
+            </w:r>
+            <w:r>
+              <w:t>num('A','I')</w:t>
             </w:r>
           </w:p>
           <w:p>
@@ -3309,15 +3294,7 @@
         <w:t xml:space="preserve">Armazena </w:t>
       </w:r>
       <w:r>
-        <w:t xml:space="preserve">os setores da empresa aos quais </w:t>
-      </w:r>
-      <w:proofErr w:type="gramStart"/>
-      <w:r>
-        <w:t>os funcionário</w:t>
-      </w:r>
-      <w:proofErr w:type="gramEnd"/>
-      <w:r>
-        <w:t xml:space="preserve"> pertencem.</w:t>
+        <w:t>os setores da empresa aos quais os funcionário pertencem.</w:t>
       </w:r>
     </w:p>
     <w:p>
@@ -3572,13 +3549,8 @@
               <w:spacing w:before="10" w:after="10"/>
               <w:contextualSpacing w:val="0"/>
             </w:pPr>
-            <w:proofErr w:type="spellStart"/>
-            <w:r>
-              <w:t>Incrementação</w:t>
-            </w:r>
-            <w:proofErr w:type="spellEnd"/>
-            <w:r>
-              <w:t xml:space="preserve"> automática</w:t>
+            <w:r>
+              <w:t>Incrementação automática</w:t>
             </w:r>
           </w:p>
         </w:tc>
@@ -3677,17 +3649,12 @@
               <w:contextualSpacing w:val="0"/>
             </w:pPr>
             <w:proofErr w:type="spellStart"/>
-            <w:proofErr w:type="gramStart"/>
             <w:r>
               <w:t>Varchar</w:t>
             </w:r>
             <w:proofErr w:type="spellEnd"/>
             <w:r>
-              <w:t>(</w:t>
-            </w:r>
-            <w:proofErr w:type="gramEnd"/>
-            <w:r>
-              <w:t>45)</w:t>
+              <w:t>(45)</w:t>
             </w:r>
           </w:p>
           <w:p>
@@ -4067,13 +4034,8 @@
               <w:spacing w:before="10" w:after="10"/>
               <w:contextualSpacing w:val="0"/>
             </w:pPr>
-            <w:proofErr w:type="spellStart"/>
-            <w:r>
-              <w:t>Incrementação</w:t>
-            </w:r>
-            <w:proofErr w:type="spellEnd"/>
-            <w:r>
-              <w:t xml:space="preserve"> automática</w:t>
+            <w:r>
+              <w:t>Incrementação automática</w:t>
             </w:r>
           </w:p>
         </w:tc>
@@ -4172,17 +4134,12 @@
               <w:contextualSpacing w:val="0"/>
             </w:pPr>
             <w:proofErr w:type="spellStart"/>
-            <w:proofErr w:type="gramStart"/>
             <w:r>
               <w:t>Varchar</w:t>
             </w:r>
             <w:proofErr w:type="spellEnd"/>
             <w:r>
-              <w:t>(</w:t>
-            </w:r>
-            <w:proofErr w:type="gramEnd"/>
-            <w:r>
-              <w:t>45)</w:t>
+              <w:t>(45)</w:t>
             </w:r>
           </w:p>
           <w:p>
@@ -4541,13 +4498,8 @@
               <w:spacing w:before="10" w:after="10"/>
               <w:contextualSpacing w:val="0"/>
             </w:pPr>
-            <w:proofErr w:type="spellStart"/>
-            <w:r>
-              <w:t>Incrementação</w:t>
-            </w:r>
-            <w:proofErr w:type="spellEnd"/>
-            <w:r>
-              <w:t xml:space="preserve"> automática</w:t>
+            <w:r>
+              <w:t>Incrementação automática</w:t>
             </w:r>
           </w:p>
         </w:tc>
@@ -4646,17 +4598,12 @@
               <w:contextualSpacing w:val="0"/>
             </w:pPr>
             <w:proofErr w:type="spellStart"/>
-            <w:proofErr w:type="gramStart"/>
             <w:r>
               <w:t>Varchar</w:t>
             </w:r>
             <w:proofErr w:type="spellEnd"/>
             <w:r>
-              <w:t>(</w:t>
-            </w:r>
-            <w:proofErr w:type="gramEnd"/>
-            <w:r>
-              <w:t>45)</w:t>
+              <w:t>(45)</w:t>
             </w:r>
           </w:p>
           <w:p>
@@ -4855,10 +4802,12 @@
                 <w:numId w:val="2"/>
               </w:numPr>
               <w:spacing w:before="10" w:after="10"/>
-              <w:contextualSpacing w:val="0"/>
-            </w:pPr>
-            <w:r>
-              <w:t>Char (1)</w:t>
+            </w:pPr>
+            <w:r>
+              <w:t>E</w:t>
+            </w:r>
+            <w:r>
+              <w:t>num('A','I')</w:t>
             </w:r>
           </w:p>
         </w:tc>
@@ -5614,13 +5563,8 @@
               <w:spacing w:before="10" w:after="10"/>
               <w:contextualSpacing w:val="0"/>
             </w:pPr>
-            <w:proofErr w:type="spellStart"/>
-            <w:r>
-              <w:t>Incrementação</w:t>
-            </w:r>
-            <w:proofErr w:type="spellEnd"/>
-            <w:r>
-              <w:t xml:space="preserve"> automática</w:t>
+            <w:r>
+              <w:t>Incrementação automática</w:t>
             </w:r>
           </w:p>
         </w:tc>
@@ -6548,13 +6492,8 @@
               <w:spacing w:before="10" w:after="10"/>
               <w:contextualSpacing w:val="0"/>
             </w:pPr>
-            <w:proofErr w:type="spellStart"/>
-            <w:r>
-              <w:t>Incrementação</w:t>
-            </w:r>
-            <w:proofErr w:type="spellEnd"/>
-            <w:r>
-              <w:t xml:space="preserve"> automática</w:t>
+            <w:r>
+              <w:t>Incrementação automática</w:t>
             </w:r>
           </w:p>
         </w:tc>
@@ -6644,10 +6583,12 @@
                 <w:numId w:val="2"/>
               </w:numPr>
               <w:spacing w:before="10" w:after="10"/>
-              <w:contextualSpacing w:val="0"/>
-            </w:pPr>
-            <w:r>
-              <w:t>Char(1)</w:t>
+            </w:pPr>
+            <w:r>
+              <w:t>E</w:t>
+            </w:r>
+            <w:r>
+              <w:t>num('E','S')</w:t>
             </w:r>
           </w:p>
         </w:tc>
@@ -7446,13 +7387,8 @@
               <w:spacing w:before="10" w:after="10"/>
               <w:contextualSpacing w:val="0"/>
             </w:pPr>
-            <w:proofErr w:type="spellStart"/>
-            <w:r>
-              <w:t>Incrementação</w:t>
-            </w:r>
-            <w:proofErr w:type="spellEnd"/>
-            <w:r>
-              <w:t xml:space="preserve"> automática</w:t>
+            <w:r>
+              <w:t>Incrementação automática</w:t>
             </w:r>
           </w:p>
         </w:tc>
@@ -7545,7 +7481,6 @@
               <w:contextualSpacing w:val="0"/>
             </w:pPr>
             <w:proofErr w:type="spellStart"/>
-            <w:proofErr w:type="gramStart"/>
             <w:r>
               <w:t>Varchar</w:t>
             </w:r>
@@ -7553,7 +7488,6 @@
             <w:r>
               <w:t>(</w:t>
             </w:r>
-            <w:proofErr w:type="gramEnd"/>
             <w:r>
               <w:t>45</w:t>
             </w:r>
@@ -7967,13 +7901,8 @@
               <w:spacing w:before="10" w:after="10"/>
               <w:contextualSpacing w:val="0"/>
             </w:pPr>
-            <w:proofErr w:type="spellStart"/>
-            <w:r>
-              <w:t>Incrementação</w:t>
-            </w:r>
-            <w:proofErr w:type="spellEnd"/>
-            <w:r>
-              <w:t xml:space="preserve"> automática</w:t>
+            <w:r>
+              <w:t>Incrementação automática</w:t>
             </w:r>
           </w:p>
         </w:tc>
@@ -8066,7 +7995,6 @@
               <w:contextualSpacing w:val="0"/>
             </w:pPr>
             <w:proofErr w:type="spellStart"/>
-            <w:proofErr w:type="gramStart"/>
             <w:r>
               <w:t>Varchar</w:t>
             </w:r>
@@ -8074,7 +8002,6 @@
             <w:r>
               <w:t>(</w:t>
             </w:r>
-            <w:proofErr w:type="gramEnd"/>
             <w:r>
               <w:t>45</w:t>
             </w:r>
@@ -8524,10 +8451,12 @@
                 <w:numId w:val="2"/>
               </w:numPr>
               <w:spacing w:before="10" w:after="10"/>
-              <w:contextualSpacing w:val="0"/>
-            </w:pPr>
-            <w:r>
-              <w:t>Char(1)</w:t>
+            </w:pPr>
+            <w:r>
+              <w:t>E</w:t>
+            </w:r>
+            <w:r>
+              <w:t>num('A','I')</w:t>
             </w:r>
           </w:p>
         </w:tc>
@@ -9392,13 +9321,8 @@
               <w:spacing w:before="10" w:after="10"/>
               <w:contextualSpacing w:val="0"/>
             </w:pPr>
-            <w:proofErr w:type="spellStart"/>
-            <w:r>
-              <w:t>Incrementação</w:t>
-            </w:r>
-            <w:proofErr w:type="spellEnd"/>
-            <w:r>
-              <w:t xml:space="preserve"> automática</w:t>
+            <w:r>
+              <w:t>Incrementação automática</w:t>
             </w:r>
           </w:p>
         </w:tc>
@@ -9491,17 +9415,12 @@
               <w:contextualSpacing w:val="0"/>
             </w:pPr>
             <w:proofErr w:type="spellStart"/>
-            <w:proofErr w:type="gramStart"/>
             <w:r>
               <w:t>Varchar</w:t>
             </w:r>
             <w:proofErr w:type="spellEnd"/>
             <w:r>
-              <w:t>(</w:t>
-            </w:r>
-            <w:proofErr w:type="gramEnd"/>
-            <w:r>
-              <w:t>45)</w:t>
+              <w:t>(45)</w:t>
             </w:r>
           </w:p>
           <w:p>
@@ -9609,17 +9528,12 @@
               <w:contextualSpacing w:val="0"/>
             </w:pPr>
             <w:proofErr w:type="spellStart"/>
-            <w:proofErr w:type="gramStart"/>
             <w:r>
               <w:t>Varchar</w:t>
             </w:r>
             <w:proofErr w:type="spellEnd"/>
             <w:r>
-              <w:t>(</w:t>
-            </w:r>
-            <w:proofErr w:type="gramEnd"/>
-            <w:r>
-              <w:t>60)</w:t>
+              <w:t>(60)</w:t>
             </w:r>
           </w:p>
           <w:p>
@@ -9824,10 +9738,12 @@
                 <w:numId w:val="2"/>
               </w:numPr>
               <w:spacing w:before="10" w:after="10"/>
-              <w:contextualSpacing w:val="0"/>
-            </w:pPr>
-            <w:r>
-              <w:t>Char(1)</w:t>
+            </w:pPr>
+            <w:r>
+              <w:t>E</w:t>
+            </w:r>
+            <w:r>
+              <w:t>num('A','I')</w:t>
             </w:r>
           </w:p>
         </w:tc>
@@ -10525,25 +10441,7 @@
               <w:rPr>
                 <w:color w:val="000000" w:themeColor="text1"/>
               </w:rPr>
-              <w:t>tb_</w:t>
-            </w:r>
-            <w:r>
-              <w:rPr>
-                <w:color w:val="000000" w:themeColor="text1"/>
-              </w:rPr>
-              <w:t>endereco</w:t>
-            </w:r>
-            <w:r>
-              <w:rPr>
-                <w:color w:val="000000" w:themeColor="text1"/>
-              </w:rPr>
-              <w:t>_id_</w:t>
-            </w:r>
-            <w:r>
-              <w:rPr>
-                <w:color w:val="000000" w:themeColor="text1"/>
-              </w:rPr>
-              <w:t>endereco</w:t>
+              <w:t>tb_endereco_id_endereco</w:t>
             </w:r>
             <w:proofErr w:type="spellEnd"/>
           </w:p>
@@ -10630,10 +10528,7 @@
             </w:r>
             <w:proofErr w:type="spellStart"/>
             <w:r>
-              <w:t>id_</w:t>
-            </w:r>
-            <w:r>
-              <w:t>endereco</w:t>
+              <w:t>id_endereco</w:t>
             </w:r>
             <w:proofErr w:type="spellEnd"/>
             <w:r>
@@ -10641,10 +10536,7 @@
             </w:r>
             <w:proofErr w:type="spellStart"/>
             <w:r>
-              <w:t>tb_</w:t>
-            </w:r>
-            <w:r>
-              <w:t>endereco</w:t>
+              <w:t>tb_endereco</w:t>
             </w:r>
             <w:proofErr w:type="spellEnd"/>
             <w:r>
@@ -10685,25 +10577,7 @@
               <w:rPr>
                 <w:color w:val="000000" w:themeColor="text1"/>
               </w:rPr>
-              <w:t>tb_</w:t>
-            </w:r>
-            <w:r>
-              <w:rPr>
-                <w:color w:val="000000" w:themeColor="text1"/>
-              </w:rPr>
-              <w:t>usuario</w:t>
-            </w:r>
-            <w:r>
-              <w:rPr>
-                <w:color w:val="000000" w:themeColor="text1"/>
-              </w:rPr>
-              <w:t>_id_</w:t>
-            </w:r>
-            <w:r>
-              <w:rPr>
-                <w:color w:val="000000" w:themeColor="text1"/>
-              </w:rPr>
-              <w:t>usuario</w:t>
+              <w:t>tb_usuario_id_usuario</w:t>
             </w:r>
             <w:proofErr w:type="spellEnd"/>
           </w:p>
@@ -10804,10 +10678,7 @@
             </w:r>
             <w:proofErr w:type="spellStart"/>
             <w:r>
-              <w:t>id_</w:t>
-            </w:r>
-            <w:r>
-              <w:t>usuario</w:t>
+              <w:t>id_usuario</w:t>
             </w:r>
             <w:proofErr w:type="spellEnd"/>
             <w:r>
@@ -10815,10 +10686,7 @@
             </w:r>
             <w:proofErr w:type="spellStart"/>
             <w:r>
-              <w:t>tb_</w:t>
-            </w:r>
-            <w:r>
-              <w:t>usuario</w:t>
+              <w:t>tb_usuario</w:t>
             </w:r>
             <w:proofErr w:type="spellEnd"/>
             <w:r>
@@ -11156,13 +11024,8 @@
               <w:spacing w:before="10" w:after="10"/>
               <w:contextualSpacing w:val="0"/>
             </w:pPr>
-            <w:proofErr w:type="spellStart"/>
-            <w:r>
-              <w:t>Incrementação</w:t>
-            </w:r>
-            <w:proofErr w:type="spellEnd"/>
-            <w:r>
-              <w:t xml:space="preserve"> automática</w:t>
+            <w:r>
+              <w:t>Incrementação automática</w:t>
             </w:r>
           </w:p>
         </w:tc>
@@ -11354,10 +11217,12 @@
                 <w:numId w:val="2"/>
               </w:numPr>
               <w:spacing w:before="10" w:after="10"/>
-              <w:contextualSpacing w:val="0"/>
-            </w:pPr>
-            <w:r>
-              <w:t>Char(1)</w:t>
+            </w:pPr>
+            <w:r>
+              <w:t>E</w:t>
+            </w:r>
+            <w:r>
+              <w:t>num('P','A','R')</w:t>
             </w:r>
           </w:p>
         </w:tc>
@@ -11422,10 +11287,7 @@
               <w:t>A</w:t>
             </w:r>
             <w:r>
-              <w:t xml:space="preserve">: </w:t>
-            </w:r>
-            <w:r>
-              <w:t>Aprovada</w:t>
+              <w:t>: Aprovada</w:t>
             </w:r>
           </w:p>
           <w:p>
@@ -11541,10 +11403,7 @@
               <w:spacing w:before="10" w:after="10"/>
             </w:pPr>
             <w:r>
-              <w:t>1 – Text</w:t>
-            </w:r>
-            <w:r>
-              <w:t>o com no máximo 255 caracteres.</w:t>
+              <w:t>1 – Texto com no máximo 255 caracteres.</w:t>
             </w:r>
           </w:p>
         </w:tc>
@@ -11780,10 +11639,7 @@
             </w:r>
             <w:proofErr w:type="spellStart"/>
             <w:r>
-              <w:t>id_</w:t>
-            </w:r>
-            <w:r>
-              <w:t>funcionario</w:t>
+              <w:t>id_funcionario</w:t>
             </w:r>
             <w:proofErr w:type="spellEnd"/>
             <w:r>
@@ -11791,10 +11647,7 @@
             </w:r>
             <w:proofErr w:type="spellStart"/>
             <w:r>
-              <w:t>tb_</w:t>
-            </w:r>
-            <w:r>
-              <w:t>funcionario</w:t>
+              <w:t>tb_funcionario</w:t>
             </w:r>
             <w:proofErr w:type="spellEnd"/>
             <w:r>
@@ -11933,10 +11786,7 @@
             </w:r>
             <w:proofErr w:type="spellStart"/>
             <w:r>
-              <w:t>id_</w:t>
-            </w:r>
-            <w:r>
-              <w:t>epi</w:t>
+              <w:t>id_epi</w:t>
             </w:r>
             <w:proofErr w:type="spellEnd"/>
             <w:r>
@@ -11944,10 +11794,7 @@
             </w:r>
             <w:proofErr w:type="spellStart"/>
             <w:r>
-              <w:t>tb_</w:t>
-            </w:r>
-            <w:r>
-              <w:t>epi</w:t>
+              <w:t>tb_epi</w:t>
             </w:r>
             <w:proofErr w:type="spellEnd"/>
             <w:r>
@@ -12012,10 +11859,7 @@
         <w:jc w:val="both"/>
       </w:pPr>
       <w:r>
-        <w:t>R</w:t>
-      </w:r>
-      <w:r>
-        <w:t>egistra a entrega de EPIs aos funcionários; aciona o gatilho de baixa de estoque (FIFO).</w:t>
+        <w:t>Registra a entrega de EPIs aos funcionários; aciona o gatilho de baixa de estoque (FIFO).</w:t>
       </w:r>
     </w:p>
     <w:p>
@@ -12270,13 +12114,8 @@
               <w:spacing w:before="10" w:after="10"/>
               <w:contextualSpacing w:val="0"/>
             </w:pPr>
-            <w:proofErr w:type="spellStart"/>
-            <w:r>
-              <w:t>Incrementação</w:t>
-            </w:r>
-            <w:proofErr w:type="spellEnd"/>
-            <w:r>
-              <w:t xml:space="preserve"> automática</w:t>
+            <w:r>
+              <w:t>Incrementação automática</w:t>
             </w:r>
           </w:p>
         </w:tc>
@@ -12336,13 +12175,7 @@
               <w:rPr>
                 <w:color w:val="000000" w:themeColor="text1"/>
               </w:rPr>
-              <w:t>dt_</w:t>
-            </w:r>
-            <w:r>
-              <w:rPr>
-                <w:color w:val="000000" w:themeColor="text1"/>
-              </w:rPr>
-              <w:t>entrega</w:t>
+              <w:t>dt_entrega</w:t>
             </w:r>
             <w:proofErr w:type="spellEnd"/>
           </w:p>
@@ -12574,10 +12407,12 @@
                 <w:numId w:val="2"/>
               </w:numPr>
               <w:spacing w:before="10" w:after="10"/>
-              <w:contextualSpacing w:val="0"/>
-            </w:pPr>
-            <w:r>
-              <w:t>Char(1)</w:t>
+            </w:pPr>
+            <w:r>
+              <w:t>E</w:t>
+            </w:r>
+            <w:r>
+              <w:t>num('A','D')</w:t>
             </w:r>
           </w:p>
         </w:tc>
@@ -12603,10 +12438,7 @@
               <w:spacing w:before="10" w:after="10"/>
             </w:pPr>
             <w:r>
-              <w:t>1 – Somente letras</w:t>
-            </w:r>
-            <w:r>
-              <w:t>.</w:t>
+              <w:t>1 – Somente letras.</w:t>
             </w:r>
           </w:p>
           <w:p>
@@ -13136,7 +12968,7 @@
 </file>
 
 <file path=word/numbering.xml><?xml version="1.0" encoding="utf-8"?>
-<w:numbering xmlns:wpc="http://schemas.microsoft.com/office/word/2010/wordprocessingCanvas" xmlns:cx="http://schemas.microsoft.com/office/drawing/2014/chartex" xmlns:mc="http://schemas.openxmlformats.org/markup-compatibility/2006" xmlns:o="urn:schemas-microsoft-com:office:office" xmlns:r="http://schemas.openxmlformats.org/officeDocument/2006/relationships" xmlns:m="http://schemas.openxmlformats.org/officeDocument/2006/math" xmlns:v="urn:schemas-microsoft-com:vml" xmlns:wp14="http://schemas.microsoft.com/office/word/2010/wordprocessingDrawing" xmlns:wp="http://schemas.openxmlformats.org/drawingml/2006/wordprocessingDrawing" xmlns:w10="urn:schemas-microsoft-com:office:word" xmlns:w="http://schemas.openxmlformats.org/wordprocessingml/2006/main" xmlns:w14="http://schemas.microsoft.com/office/word/2010/wordml" xmlns:w15="http://schemas.microsoft.com/office/word/2012/wordml" xmlns:w16se="http://schemas.microsoft.com/office/word/2015/wordml/symex" xmlns:wpg="http://schemas.microsoft.com/office/word/2010/wordprocessingGroup" xmlns:wpi="http://schemas.microsoft.com/office/word/2010/wordprocessingInk" xmlns:wne="http://schemas.microsoft.com/office/word/2006/wordml" xmlns:wps="http://schemas.microsoft.com/office/word/2010/wordprocessingShape" mc:Ignorable="w14 w15 w16se wp14">
+<w:numbering xmlns:wpc="http://schemas.microsoft.com/office/word/2010/wordprocessingCanvas" xmlns:cx="http://schemas.microsoft.com/office/drawing/2014/chartex" xmlns:cx1="http://schemas.microsoft.com/office/drawing/2015/9/8/chartex" xmlns:cx2="http://schemas.microsoft.com/office/drawing/2015/10/21/chartex" xmlns:cx3="http://schemas.microsoft.com/office/drawing/2016/5/9/chartex" xmlns:cx4="http://schemas.microsoft.com/office/drawing/2016/5/10/chartex" xmlns:cx5="http://schemas.microsoft.com/office/drawing/2016/5/11/chartex" xmlns:cx6="http://schemas.microsoft.com/office/drawing/2016/5/12/chartex" xmlns:cx7="http://schemas.microsoft.com/office/drawing/2016/5/13/chartex" xmlns:cx8="http://schemas.microsoft.com/office/drawing/2016/5/14/chartex" xmlns:mc="http://schemas.openxmlformats.org/markup-compatibility/2006" xmlns:aink="http://schemas.microsoft.com/office/drawing/2016/ink" xmlns:am3d="http://schemas.microsoft.com/office/drawing/2017/model3d" xmlns:o="urn:schemas-microsoft-com:office:office" xmlns:oel="http://schemas.microsoft.com/office/2019/extlst" xmlns:r="http://schemas.openxmlformats.org/officeDocument/2006/relationships" xmlns:m="http://schemas.openxmlformats.org/officeDocument/2006/math" xmlns:v="urn:schemas-microsoft-com:vml" xmlns:wp14="http://schemas.microsoft.com/office/word/2010/wordprocessingDrawing" xmlns:wp="http://schemas.openxmlformats.org/drawingml/2006/wordprocessingDrawing" xmlns:w10="urn:schemas-microsoft-com:office:word" xmlns:w="http://schemas.openxmlformats.org/wordprocessingml/2006/main" xmlns:w14="http://schemas.microsoft.com/office/word/2010/wordml" xmlns:w15="http://schemas.microsoft.com/office/word/2012/wordml" xmlns:w16cex="http://schemas.microsoft.com/office/word/2018/wordml/cex" xmlns:w16cid="http://schemas.microsoft.com/office/word/2016/wordml/cid" xmlns:w16="http://schemas.microsoft.com/office/word/2018/wordml" xmlns:w16du="http://schemas.microsoft.com/office/word/2023/wordml/word16du" xmlns:w16sdtdh="http://schemas.microsoft.com/office/word/2020/wordml/sdtdatahash" xmlns:w16sdtfl="http://schemas.microsoft.com/office/word/2024/wordml/sdtformatlock" xmlns:w16se="http://schemas.microsoft.com/office/word/2015/wordml/symex" xmlns:wpg="http://schemas.microsoft.com/office/word/2010/wordprocessingGroup" xmlns:wpi="http://schemas.microsoft.com/office/word/2010/wordprocessingInk" xmlns:wne="http://schemas.microsoft.com/office/word/2006/wordml" xmlns:wps="http://schemas.microsoft.com/office/word/2010/wordprocessingShape" mc:Ignorable="w14 w15 w16se w16cid w16 w16cex w16sdtdh w16sdtfl w16du wp14">
   <w:abstractNum w:abstractNumId="0" w15:restartNumberingAfterBreak="0">
     <w:nsid w:val="1BE37AF1"/>
     <w:multiLevelType w:val="hybridMultilevel"/>
@@ -13304,10 +13136,10 @@
       </w:rPr>
     </w:lvl>
   </w:abstractNum>
-  <w:num w:numId="1">
+  <w:num w:numId="1" w16cid:durableId="1135104234">
     <w:abstractNumId w:val="1"/>
   </w:num>
-  <w:num w:numId="2">
+  <w:num w:numId="2" w16cid:durableId="151918242">
     <w:abstractNumId w:val="0"/>
     <w:lvlOverride w:ilvl="0">
       <w:startOverride w:val="1"/>
@@ -13317,7 +13149,7 @@
 </file>
 
 <file path=word/styles.xml><?xml version="1.0" encoding="utf-8"?>
-<w:styles xmlns:mc="http://schemas.openxmlformats.org/markup-compatibility/2006" xmlns:r="http://schemas.openxmlformats.org/officeDocument/2006/relationships" xmlns:w="http://schemas.openxmlformats.org/wordprocessingml/2006/main" xmlns:w14="http://schemas.microsoft.com/office/word/2010/wordml" xmlns:w15="http://schemas.microsoft.com/office/word/2012/wordml" xmlns:w16se="http://schemas.microsoft.com/office/word/2015/wordml/symex" mc:Ignorable="w14 w15 w16se">
+<w:styles xmlns:mc="http://schemas.openxmlformats.org/markup-compatibility/2006" xmlns:r="http://schemas.openxmlformats.org/officeDocument/2006/relationships" xmlns:w="http://schemas.openxmlformats.org/wordprocessingml/2006/main" xmlns:w14="http://schemas.microsoft.com/office/word/2010/wordml" xmlns:w15="http://schemas.microsoft.com/office/word/2012/wordml" xmlns:w16cex="http://schemas.microsoft.com/office/word/2018/wordml/cex" xmlns:w16cid="http://schemas.microsoft.com/office/word/2016/wordml/cid" xmlns:w16="http://schemas.microsoft.com/office/word/2018/wordml" xmlns:w16du="http://schemas.microsoft.com/office/word/2023/wordml/word16du" xmlns:w16sdtdh="http://schemas.microsoft.com/office/word/2020/wordml/sdtdatahash" xmlns:w16sdtfl="http://schemas.microsoft.com/office/word/2024/wordml/sdtformatlock" xmlns:w16se="http://schemas.microsoft.com/office/word/2015/wordml/symex" mc:Ignorable="w14 w15 w16se w16cid w16 w16cex w16sdtdh w16sdtfl w16du">
   <w:docDefaults>
     <w:rPrDefault>
       <w:rPr>
@@ -13335,7 +13167,7 @@
       </w:pPr>
     </w:pPrDefault>
   </w:docDefaults>
-  <w:latentStyles w:defLockedState="0" w:defUIPriority="99" w:defSemiHidden="0" w:defUnhideWhenUsed="0" w:defQFormat="0" w:count="371">
+  <w:latentStyles w:defLockedState="0" w:defUIPriority="99" w:defSemiHidden="0" w:defUnhideWhenUsed="0" w:defQFormat="0" w:count="376">
     <w:lsdException w:name="Normal" w:uiPriority="0" w:qFormat="1"/>
     <w:lsdException w:name="heading 1" w:uiPriority="9" w:qFormat="1"/>
     <w:lsdException w:name="heading 2" w:semiHidden="1" w:uiPriority="9" w:unhideWhenUsed="1" w:qFormat="1"/>
@@ -13707,6 +13539,11 @@
     <w:lsdException w:name="List Table 5 Dark Accent 6" w:uiPriority="50"/>
     <w:lsdException w:name="List Table 6 Colorful Accent 6" w:uiPriority="51"/>
     <w:lsdException w:name="List Table 7 Colorful Accent 6" w:uiPriority="52"/>
+    <w:lsdException w:name="Mention" w:semiHidden="1" w:unhideWhenUsed="1"/>
+    <w:lsdException w:name="Smart Hyperlink" w:semiHidden="1" w:unhideWhenUsed="1"/>
+    <w:lsdException w:name="Hashtag" w:semiHidden="1" w:unhideWhenUsed="1"/>
+    <w:lsdException w:name="Unresolved Mention" w:semiHidden="1" w:unhideWhenUsed="1"/>
+    <w:lsdException w:name="Smart Link" w:semiHidden="1" w:unhideWhenUsed="1"/>
   </w:latentStyles>
   <w:style w:type="paragraph" w:default="1" w:styleId="Normal">
     <w:name w:val="Normal"/>
@@ -13924,7 +13761,6 @@
   <w:style w:type="character" w:default="1" w:styleId="Fontepargpadro">
     <w:name w:val="Default Paragraph Font"/>
     <w:uiPriority w:val="1"/>
-    <w:semiHidden/>
     <w:unhideWhenUsed/>
   </w:style>
   <w:style w:type="table" w:default="1" w:styleId="Tabelanormal">

</xml_diff>